<commit_message>
Improve Kit Galaxy visual fidelity
</commit_message>
<xml_diff>
--- a/docs/Warehouse-Wallboard-Operations-Guide.docx
+++ b/docs/Warehouse-Wallboard-Operations-Guide.docx
@@ -52,11 +52,9 @@
           <w:b/>
           <w:bCs/>
         </w:rPr>
-        <w:t xml:space="preserve">Document version: </w:t>
-      </w:r>
-      <w:r>
-        <w:t xml:space="preserve">1.0 (July 9, 2026)</w:t>
-      </w:r>
+        <w:t>Document version: 1.1 (July 13, 2026)</w:t>
+      </w:r>
+      <w:r/>
     </w:p>
     <w:p>
       <w:pPr>
@@ -1812,6 +1810,29 @@
     <w:p>
       <w:r>
         <w:br w:type="page"/>
+      </w:r>
+    </w:p>
+    <w:p>
+      <w:pPr>
+        <w:pStyle w:val="Heading2"/>
+      </w:pPr>
+      <w:r>
+        <w:t>3.6 Kit Galaxy</w:t>
+      </w:r>
+    </w:p>
+    <w:p>
+      <w:r>
+        <w:t>Use the header toggle to open Kit Galaxy. Suns are schools, planets are kit orders, and the solid shaded moons are Sale/Kit component lines. Moon color shows pick state: green is complete, amber is partially picked, and grey has not started. Moon size is automatically compensated as the view zooms out so components stay readable; this visual scaling does not change quantities or status.</w:t>
+      </w:r>
+    </w:p>
+    <w:p>
+      <w:r>
+        <w:t>A small starship orbiting a kit means the Fishbowl sales order has a customer PO reference on file. The board sends only that yes/no indicator to the Galaxy, not the PO number. This is separate from the supplier open-PO coverage used by the Ready-to-Pick stock badges in section 4.4.</w:t>
+      </w:r>
+    </w:p>
+    <w:p>
+      <w:r>
+        <w:t>Drag to orbit, use the mouse wheel to zoom, and right-drag to pan. Hovering a body pauses motion; click a school or kit for details, then press Esc or click empty space to close the panel.</w:t>
       </w:r>
     </w:p>
     <w:p>

</xml_diff>